<commit_message>
Versão de demonstração compilada
</commit_message>
<xml_diff>
--- a/.demo/dist/modelos/AnkoraOne-Modelos-DORA.docx
+++ b/.demo/dist/modelos/AnkoraOne-Modelos-DORA.docx
@@ -119,7 +119,7 @@
           </w:p>
           <w:p>
             <w:pPr>
-              <w:spacing w:after="1600" w:line="300"/>
+              <w:spacing w:after="1200" w:line="300"/>
             </w:pPr>
             <w:r>
               <w:rPr>
@@ -129,6 +129,31 @@
                 <w:szCs w:val="24"/>
               </w:rPr>
               <w:t xml:space="preserve">Classificação de incidentes, notificação inicial, relatórios intercalar e final, notificação de ciberameaças, índice do quadro de gestão do risco TIC e organização do registo de informação.</w:t>
+            </w:r>
+          </w:p>
+          <w:p>
+            <w:pPr>
+              <w:spacing w:after="360" w:line="300"/>
+            </w:pPr>
+            <w:r>
+              <w:rPr>
+                <w:rFonts w:ascii="Calibri" w:cs="Calibri" w:eastAsia="Calibri" w:hAnsi="Calibri"/>
+                <w:b/>
+                <w:bCs/>
+                <w:color w:val="CFA04A"/>
+                <w:sz w:val="22"/>
+                <w:szCs w:val="22"/>
+              </w:rPr>
+              <w:t xml:space="preserve">AnkoraOne: </w:t>
+            </w:r>
+            <w:r>
+              <w:rPr>
+                <w:rFonts w:ascii="Calibri" w:cs="Calibri" w:eastAsia="Calibri" w:hAnsi="Calibri"/>
+                <w:color w:val="FFFFFF"/>
+                <w:sz w:val="22"/>
+                <w:szCs w:val="22"/>
+              </w:rPr>
+              <w:t xml:space="preserve">a infraestrutura inteligente de governação, risco e conformidade</w:t>
             </w:r>
           </w:p>
           <w:p>

</xml_diff>